<commit_message>
Recapture the quiz documentation against the finished API
The examples were taken before the answer key was withheld from a failed
attempt and before the section counter stopped counting book passes, so the
document showed responses the API no longer gives.

Co-Authored-By: Claude Opus 5 <noreply@anthropic.com>
</commit_message>
<xml_diff>
--- a/docs/Himam-Quiz-APIs.docx
+++ b/docs/Himam-Quiz-APIs.docx
@@ -7843,22 +7843,22 @@
           <w:sz w:val="17"/>
           <w:szCs w:val="17"/>
         </w:rPr>
-        <w:t xml:space="preserve">      "id": 39,</w:t>
-      </w:r>
-    </w:p>
-    <w:p>
-      <w:pPr>
-        <w:shd w:fill="F6F6F4" w:val="clear"/>
-        <w:spacing w:after="0" w:before="0" w:line="240"/>
-        <w:ind w:left="180" w:right="180"/>
-      </w:pPr>
-      <w:r>
-        <w:rPr>
-          <w:rFonts w:ascii="Consolas" w:cs="Consolas" w:eastAsia="Consolas" w:hAnsi="Consolas"/>
-          <w:sz w:val="17"/>
-          <w:szCs w:val="17"/>
-        </w:rPr>
-        <w:t xml:space="preserve">      "serial": "CERT-2026-VNLD8D",</w:t>
+        <w:t xml:space="preserve">      "id": 41,</w:t>
+      </w:r>
+    </w:p>
+    <w:p>
+      <w:pPr>
+        <w:shd w:fill="F6F6F4" w:val="clear"/>
+        <w:spacing w:after="0" w:before="0" w:line="240"/>
+        <w:ind w:left="180" w:right="180"/>
+      </w:pPr>
+      <w:r>
+        <w:rPr>
+          <w:rFonts w:ascii="Consolas" w:cs="Consolas" w:eastAsia="Consolas" w:hAnsi="Consolas"/>
+          <w:sz w:val="17"/>
+          <w:szCs w:val="17"/>
+        </w:rPr>
+        <w:t xml:space="preserve">      "serial": "CERT-2026-59YYKL",</w:t>
       </w:r>
     </w:p>
     <w:p>
@@ -7903,7 +7903,7 @@
           <w:sz w:val="17"/>
           <w:szCs w:val="17"/>
         </w:rPr>
-        <w:t xml:space="preserve">      "verification_url": "http://127.0.0.1:8000/api/certificates/verify/dd671d21-1597-47e3-b2cb-35fe7a221067"</w:t>
+        <w:t xml:space="preserve">      "verification_url": "http://127.0.0.1:8000/api/certificates/verify/76f5b1c3-df05-42b3-b87c-36c8cf5b8057"</w:t>
       </w:r>
     </w:p>
     <w:p>
@@ -9834,7 +9834,7 @@
           <w:sz w:val="17"/>
           <w:szCs w:val="17"/>
         </w:rPr>
-        <w:t xml:space="preserve">      "id": 99,</w:t>
+        <w:t xml:space="preserve">      "id": 104,</w:t>
       </w:r>
     </w:p>
     <w:p>
@@ -9924,7 +9924,7 @@
           <w:sz w:val="17"/>
           <w:szCs w:val="17"/>
         </w:rPr>
-        <w:t xml:space="preserve">      "published_at": "2026-10-14T17:40:14+00:00",</w:t>
+        <w:t xml:space="preserve">      "published_at": "2026-10-14T17:48:01+00:00",</w:t>
       </w:r>
     </w:p>
     <w:p>
@@ -9984,7 +9984,7 @@
           <w:sz w:val="17"/>
           <w:szCs w:val="17"/>
         </w:rPr>
-        <w:t xml:space="preserve">      "id": 97,</w:t>
+        <w:t xml:space="preserve">      "id": 102,</w:t>
       </w:r>
     </w:p>
     <w:p>
@@ -10074,7 +10074,7 @@
           <w:sz w:val="17"/>
           <w:szCs w:val="17"/>
         </w:rPr>
-        <w:t xml:space="preserve">      "published_at": "2026-10-14T17:40:09+00:00",</w:t>
+        <w:t xml:space="preserve">      "published_at": "2026-10-14T17:47:56+00:00",</w:t>
       </w:r>
     </w:p>
     <w:p>
@@ -10134,7 +10134,7 @@
           <w:sz w:val="17"/>
           <w:szCs w:val="17"/>
         </w:rPr>
-        <w:t xml:space="preserve">      "id": 98,</w:t>
+        <w:t xml:space="preserve">      "id": 103,</w:t>
       </w:r>
     </w:p>
     <w:p>
@@ -10179,7 +10179,7 @@
           <w:sz w:val="17"/>
           <w:szCs w:val="17"/>
         </w:rPr>
-        <w:t xml:space="preserve">      "body": "Congratulations — your certificate for “A book without sections” has been issued with serial CERT-2026-VNLD8D. You will find it on the certificates page.",</w:t>
+        <w:t xml:space="preserve">      "body": "Congratulations — your certificate for “A book without sections” has been issued with serial CERT-2026-59YYKL. You will find it on the certificates page.",</w:t>
       </w:r>
     </w:p>
     <w:p>
@@ -10224,7 +10224,7 @@
           <w:sz w:val="17"/>
           <w:szCs w:val="17"/>
         </w:rPr>
-        <w:t xml:space="preserve">      "published_at": "2026-10-14T17:40:09+00:00",</w:t>
+        <w:t xml:space="preserve">      "published_at": "2026-10-14T17:47:56+00:00",</w:t>
       </w:r>
     </w:p>
     <w:p>
@@ -11039,22 +11039,22 @@
           <w:sz w:val="17"/>
           <w:szCs w:val="17"/>
         </w:rPr>
-        <w:t xml:space="preserve">      "id": 39,</w:t>
-      </w:r>
-    </w:p>
-    <w:p>
-      <w:pPr>
-        <w:shd w:fill="F6F6F4" w:val="clear"/>
-        <w:spacing w:after="0" w:before="0" w:line="240"/>
-        <w:ind w:left="180" w:right="180"/>
-      </w:pPr>
-      <w:r>
-        <w:rPr>
-          <w:rFonts w:ascii="Consolas" w:cs="Consolas" w:eastAsia="Consolas" w:hAnsi="Consolas"/>
-          <w:sz w:val="17"/>
-          <w:szCs w:val="17"/>
-        </w:rPr>
-        <w:t xml:space="preserve">      "serial": "CERT-2026-VNLD8D",</w:t>
+        <w:t xml:space="preserve">      "id": 41,</w:t>
+      </w:r>
+    </w:p>
+    <w:p>
+      <w:pPr>
+        <w:shd w:fill="F6F6F4" w:val="clear"/>
+        <w:spacing w:after="0" w:before="0" w:line="240"/>
+        <w:ind w:left="180" w:right="180"/>
+      </w:pPr>
+      <w:r>
+        <w:rPr>
+          <w:rFonts w:ascii="Consolas" w:cs="Consolas" w:eastAsia="Consolas" w:hAnsi="Consolas"/>
+          <w:sz w:val="17"/>
+          <w:szCs w:val="17"/>
+        </w:rPr>
+        <w:t xml:space="preserve">      "serial": "CERT-2026-59YYKL",</w:t>
       </w:r>
     </w:p>
     <w:p>
@@ -11354,7 +11354,7 @@
           <w:sz w:val="17"/>
           <w:szCs w:val="17"/>
         </w:rPr>
-        <w:t xml:space="preserve">      "verification_url": "http://127.0.0.1:8000/api/certificates/verify/dd671d21-1597-47e3-b2cb-35fe7a221067"</w:t>
+        <w:t xml:space="preserve">      "verification_url": "http://127.0.0.1:8000/api/certificates/verify/76f5b1c3-df05-42b3-b87c-36c8cf5b8057"</w:t>
       </w:r>
     </w:p>
     <w:p>

</xml_diff>